<commit_message>
Updated for KPIT exit date
</commit_message>
<xml_diff>
--- a/GVRAO_2026.docx
+++ b/GVRAO_2026.docx
@@ -672,14 +672,7 @@
                 <w:color w:val="FFFFFF" w:themeColor="background1"/>
                 <w:sz w:val="15"/>
               </w:rPr>
-              <w:t xml:space="preserve"> </w:t>
-            </w:r>
-            <w:r>
-              <w:rPr>
-                <w:color w:val="FFFFFF" w:themeColor="background1"/>
-                <w:sz w:val="15"/>
-              </w:rPr>
-              <w:t xml:space="preserve">  </w:t>
+              <w:t xml:space="preserve">   </w:t>
             </w:r>
           </w:p>
           <w:p>
@@ -911,7 +904,7 @@
           </mc:Choice>
           <mc:Fallback>
             <w:pict>
-              <v:group w14:anchorId="75779E69" id="Group 5" o:spid="_x0000_s1026" style="position:absolute;margin-left:32.65pt;margin-top:10.35pt;width:527.4pt;height:8.9pt;z-index:15729664;mso-wrap-distance-left:0;mso-wrap-distance-right:0;mso-position-horizontal-relative:page" coordsize="66979,1130" o:gfxdata="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">
+              <v:group w14:anchorId="6686FA84" id="Group 5" o:spid="_x0000_s1026" style="position:absolute;margin-left:32.65pt;margin-top:10.35pt;width:527.4pt;height:8.9pt;z-index:15729664;mso-wrap-distance-left:0;mso-wrap-distance-right:0;mso-position-horizontal-relative:page" coordsize="66979,1130" o:gfxdata="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">
                 <v:shapetype id="_x0000_t75" coordsize="21600,21600" o:spt="75" o:preferrelative="t" path="m@4@5l@4@11@9@11@9@5xe" filled="f" stroked="f">
                   <v:stroke joinstyle="miter"/>
                   <v:formulas>
@@ -988,13 +981,7 @@
         <w:rPr>
           <w:color w:val="22303A"/>
         </w:rPr>
-        <w:t>in embedded software architecture, automotive software, real-time systems, Android/Linux/QNX platforms, BSP development, device drivers, system integration, and</w:t>
-      </w:r>
-      <w:r>
-        <w:rPr>
-          <w:color w:val="22303A"/>
-        </w:rPr>
-        <w:t xml:space="preserve"> product engineering across automotive and other safety-critical domains.</w:t>
+        <w:t>in embedded software architecture, automotive software, real-time systems, Android/Linux/QNX platforms, BSP development, device drivers, system integration, and product engineering across automotive and other safety-critical domains.</w:t>
       </w:r>
     </w:p>
     <w:p>
@@ -1034,14 +1021,7 @@
           <w:color w:val="22303A"/>
           <w:sz w:val="16"/>
         </w:rPr>
-        <w:t>Te</w:t>
-      </w:r>
-      <w:r>
-        <w:rPr>
-          <w:color w:val="22303A"/>
-          <w:sz w:val="16"/>
-        </w:rPr>
-        <w:t>lechips</w:t>
+        <w:t>Telechips</w:t>
       </w:r>
       <w:proofErr w:type="spellEnd"/>
       <w:r>
@@ -1082,14 +1062,7 @@
           <w:color w:val="22303A"/>
           <w:sz w:val="16"/>
         </w:rPr>
-        <w:t>Hands-on experience with Qu</w:t>
-      </w:r>
-      <w:r>
-        <w:rPr>
-          <w:color w:val="22303A"/>
-          <w:sz w:val="16"/>
-        </w:rPr>
-        <w:t xml:space="preserve">alcomm automotive platforms including </w:t>
+        <w:t xml:space="preserve">Hands-on experience with Qualcomm automotive platforms including </w:t>
       </w:r>
       <w:r>
         <w:rPr>
@@ -1224,13 +1197,7 @@
         <w:rPr>
           <w:color w:val="22303A"/>
         </w:rPr>
-        <w:t xml:space="preserve"> ResNet34/50, QNN SDK and HTP-based inference. Proven technical leadership across architec</w:t>
-      </w:r>
-      <w:r>
-        <w:rPr>
-          <w:color w:val="22303A"/>
-        </w:rPr>
-        <w:t>ture, design reviews, RFQ/SOW</w:t>
+        <w:t xml:space="preserve"> ResNet34/50, QNN SDK and HTP-based inference. Proven technical leadership across architecture, design reviews, RFQ/SOW</w:t>
       </w:r>
       <w:r>
         <w:rPr>
@@ -1355,7 +1322,7 @@
           </mc:Choice>
           <mc:Fallback>
             <w:pict>
-              <v:group w14:anchorId="7EE5A39A" id="Group 8" o:spid="_x0000_s1026" style="position:absolute;margin-left:32.65pt;margin-top:16.7pt;width:527.4pt;height:9.75pt;z-index:-15847424;mso-wrap-distance-left:0;mso-wrap-distance-right:0;mso-position-horizontal-relative:page" coordsize="66979,1238" o:gfxdata="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">
+              <v:group w14:anchorId="409B9426" id="Group 8" o:spid="_x0000_s1026" style="position:absolute;margin-left:32.65pt;margin-top:16.7pt;width:527.4pt;height:9.75pt;z-index:-15847424;mso-wrap-distance-left:0;mso-wrap-distance-right:0;mso-position-horizontal-relative:page" coordsize="66979,1238" o:gfxdata="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">
                 <v:shape id="Image 9" o:spid="_x0000_s1027" type="#_x0000_t75" style="position:absolute;width:66979;height:1234;visibility:visible;mso-wrap-style:square" o:gfxdata="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">
                   <v:imagedata r:id="rId14" o:title=""/>
                 </v:shape>
@@ -1607,14 +1574,7 @@
           <w:color w:val="22303A"/>
           <w:sz w:val="16"/>
         </w:rPr>
-        <w:t>/ Android BSP | Android Internals | Android HAL / Android NDK | Android OS Migration &amp; Platform Upgrades | Embedded Linux / Linux Kernel / Linux BSP | QNX BSP &amp; Application Development | Non-hypervisor &amp;</w:t>
-      </w:r>
-      <w:r>
-        <w:rPr>
-          <w:color w:val="22303A"/>
-          <w:sz w:val="16"/>
-        </w:rPr>
-        <w:t xml:space="preserve"> Hypervisor-based Platforms | Qualcomm Automotive Platforms | Board Bring-up &amp; Platform Customization, Device Drivers &amp; Hardware/Software Integration | IVI / Instrument Cluster / METER / HUD | ADAS / DMS</w:t>
+        <w:t>/ Android BSP | Android Internals | Android HAL / Android NDK | Android OS Migration &amp; Platform Upgrades | Embedded Linux / Linux Kernel / Linux BSP | QNX BSP &amp; Application Development | Non-hypervisor &amp; Hypervisor-based Platforms | Qualcomm Automotive Platforms | Board Bring-up &amp; Platform Customization, Device Drivers &amp; Hardware/Software Integration | IVI / Instrument Cluster / METER / HUD | ADAS / DMS</w:t>
       </w:r>
       <w:r>
         <w:rPr>
@@ -1629,14 +1589,7 @@
           <w:color w:val="22303A"/>
           <w:sz w:val="16"/>
         </w:rPr>
-        <w:t>/ OMS / SVM | AI/ML Model Development &amp; Deployment |</w:t>
-      </w:r>
-      <w:r>
-        <w:rPr>
-          <w:color w:val="22303A"/>
-          <w:sz w:val="16"/>
-        </w:rPr>
-        <w:t xml:space="preserve"> QNN / CPU / GPU / DSP / HTP / NPU Inference | x86 / ARM / RISC-V Embedded Platforms</w:t>
+        <w:t>/ OMS / SVM | AI/ML Model Development &amp; Deployment | QNN / CPU / GPU / DSP / HTP / NPU Inference | x86 / ARM / RISC-V Embedded Platforms</w:t>
       </w:r>
       <w:r>
         <w:rPr>
@@ -2567,15 +2520,7 @@
           <w:spacing w:val="-4"/>
           <w:sz w:val="16"/>
         </w:rPr>
-        <w:t>m</w:t>
-      </w:r>
-      <w:r>
-        <w:rPr>
-          <w:color w:val="22303A"/>
-          <w:spacing w:val="-4"/>
-          <w:sz w:val="16"/>
-        </w:rPr>
-        <w:t>icroprocessors</w:t>
+        <w:t>microprocessors</w:t>
       </w:r>
       <w:r>
         <w:rPr>
@@ -3320,7 +3265,7 @@
           </mc:Choice>
           <mc:Fallback>
             <w:pict>
-              <v:group w14:anchorId="4170EC4A" id="Group 11" o:spid="_x0000_s1026" style="width:532.2pt;height:7.8pt;mso-position-horizontal-relative:char;mso-position-vertical-relative:line" coordsize="67589,990" o:gfxdata="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">
+              <v:group w14:anchorId="42AB5142" id="Group 11" o:spid="_x0000_s1026" style="width:532.2pt;height:7.8pt;mso-position-horizontal-relative:char;mso-position-vertical-relative:line" coordsize="67589,990" o:gfxdata="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">
                 <v:shape id="Image 12" o:spid="_x0000_s1027" type="#_x0000_t75" style="position:absolute;width:67589;height:989;visibility:visible;mso-wrap-style:square" o:gfxdata="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">
                   <v:imagedata r:id="rId16" o:title=""/>
                 </v:shape>
@@ -3595,13 +3540,7 @@
         <w:rPr>
           <w:color w:val="22303A"/>
         </w:rPr>
-        <w:t>D3/</w:t>
-      </w:r>
-      <w:r>
-        <w:rPr>
-          <w:color w:val="22303A"/>
-        </w:rPr>
-        <w:t>D5,</w:t>
+        <w:t>D3/D5,</w:t>
       </w:r>
       <w:r>
         <w:rPr>
@@ -5912,7 +5851,7 @@
           </mc:Choice>
           <mc:Fallback>
             <w:pict>
-              <v:group w14:anchorId="2C09F31A" id="Group 14" o:spid="_x0000_s1026" style="position:absolute;margin-left:30.6pt;margin-top:14.65pt;width:532.2pt;height:7.8pt;z-index:-15846400;mso-wrap-distance-left:0;mso-wrap-distance-right:0;mso-position-horizontal-relative:page" coordsize="67589,990" o:gfxdata="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">
+              <v:group w14:anchorId="5F92D36D" id="Group 14" o:spid="_x0000_s1026" style="position:absolute;margin-left:30.6pt;margin-top:14.65pt;width:532.2pt;height:7.8pt;z-index:-15846400;mso-wrap-distance-left:0;mso-wrap-distance-right:0;mso-position-horizontal-relative:page" coordsize="67589,990" o:gfxdata="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">
                 <v:shape id="Image 15" o:spid="_x0000_s1027" type="#_x0000_t75" style="position:absolute;width:67589;height:989;visibility:visible;mso-wrap-style:square" o:gfxdata="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">
                   <v:imagedata r:id="rId16" o:title=""/>
                 </v:shape>
@@ -6239,7 +6178,7 @@
           <w:spacing w:val="9"/>
           <w:sz w:val="16"/>
         </w:rPr>
-        <w:t>Present</w:t>
+        <w:t>Aug 2026</w:t>
       </w:r>
     </w:p>
     <w:p>
@@ -20195,6 +20134,14 @@
       <w:r>
         <w:rPr>
           <w:color w:val="22303A"/>
+          <w:spacing w:val="-4"/>
+          <w:sz w:val="16"/>
+        </w:rPr>
+        <w:t xml:space="preserve">bare-metal </w:t>
+      </w:r>
+      <w:r>
+        <w:rPr>
+          <w:color w:val="22303A"/>
           <w:spacing w:val="-2"/>
           <w:sz w:val="16"/>
         </w:rPr>
@@ -20207,6 +20154,27 @@
           <w:sz w:val="16"/>
         </w:rPr>
         <w:t xml:space="preserve"> </w:t>
+      </w:r>
+      <w:r>
+        <w:rPr>
+          <w:color w:val="22303A"/>
+          <w:sz w:val="16"/>
+        </w:rPr>
+        <w:t xml:space="preserve">in C </w:t>
+      </w:r>
+      <w:r>
+        <w:rPr>
+          <w:color w:val="22303A"/>
+          <w:sz w:val="16"/>
+        </w:rPr>
+        <w:t xml:space="preserve">&amp; </w:t>
+      </w:r>
+      <w:r>
+        <w:rPr>
+          <w:color w:val="22303A"/>
+          <w:sz w:val="16"/>
+        </w:rPr>
+        <w:t xml:space="preserve">Assembly language </w:t>
       </w:r>
       <w:r>
         <w:rPr>
@@ -20832,7 +20800,7 @@
           </mc:Choice>
           <mc:Fallback>
             <w:pict>
-              <v:group w14:anchorId="11A7EE63" id="Group 17" o:spid="_x0000_s1026" style="position:absolute;margin-left:30.5pt;margin-top:11pt;width:532.2pt;height:7.8pt;z-index:15731712;mso-wrap-distance-left:0;mso-wrap-distance-right:0;mso-position-horizontal-relative:page" coordsize="67589,990" o:gfxdata="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">
+              <v:group w14:anchorId="76F8BB5F" id="Group 17" o:spid="_x0000_s1026" style="position:absolute;margin-left:30.5pt;margin-top:11pt;width:532.2pt;height:7.8pt;z-index:15731712;mso-wrap-distance-left:0;mso-wrap-distance-right:0;mso-position-horizontal-relative:page" coordsize="67589,990" o:gfxdata="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">
                 <v:shape id="Image 18" o:spid="_x0000_s1027" type="#_x0000_t75" style="position:absolute;width:67589;height:989;visibility:visible;mso-wrap-style:square" o:gfxdata="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">
                   <v:imagedata r:id="rId19" o:title=""/>
                 </v:shape>
@@ -22029,7 +21997,7 @@
           </mc:Choice>
           <mc:Fallback>
             <w:pict>
-              <v:group w14:anchorId="3693B712" id="Group 20" o:spid="_x0000_s1026" style="width:532.2pt;height:7.8pt;mso-position-horizontal-relative:char;mso-position-vertical-relative:line" coordsize="67589,990" o:gfxdata="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">
+              <v:group w14:anchorId="46CE5ADF" id="Group 20" o:spid="_x0000_s1026" style="width:532.2pt;height:7.8pt;mso-position-horizontal-relative:char;mso-position-vertical-relative:line" coordsize="67589,990" o:gfxdata="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">
                 <v:shape id="Image 21" o:spid="_x0000_s1027" type="#_x0000_t75" style="position:absolute;width:67589;height:989;visibility:visible;mso-wrap-style:square" o:gfxdata="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">
                   <v:imagedata r:id="rId21" o:title=""/>
                 </v:shape>
@@ -22818,7 +22786,7 @@
           </mc:Choice>
           <mc:Fallback>
             <w:pict>
-              <v:group w14:anchorId="3CB62F2F" id="Group 23" o:spid="_x0000_s1026" style="position:absolute;margin-left:31.9pt;margin-top:13.95pt;width:529.35pt;height:5.7pt;z-index:-15726080;mso-wrap-distance-left:0;mso-wrap-distance-right:0;mso-position-horizontal-relative:page" coordsize="67227,723" o:gfxdata="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">
+              <v:group w14:anchorId="3E405989" id="Group 23" o:spid="_x0000_s1026" style="position:absolute;margin-left:31.9pt;margin-top:13.95pt;width:529.35pt;height:5.7pt;z-index:-15726080;mso-wrap-distance-left:0;mso-wrap-distance-right:0;mso-position-horizontal-relative:page" coordsize="67227,723" o:gfxdata="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">
                 <v:shape id="Image 24" o:spid="_x0000_s1027" type="#_x0000_t75" style="position:absolute;width:67224;height:719;visibility:visible;mso-wrap-style:square" o:gfxdata="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">
                   <v:imagedata r:id="rId23" o:title=""/>
                 </v:shape>
@@ -23589,7 +23557,7 @@
           </mc:Choice>
           <mc:Fallback>
             <w:pict>
-              <v:group w14:anchorId="03FBF823" id="Group 26" o:spid="_x0000_s1026" style="position:absolute;margin-left:30.5pt;margin-top:18.75pt;width:532.1pt;height:7.8pt;z-index:15732224;mso-wrap-distance-left:0;mso-wrap-distance-right:0;mso-position-horizontal-relative:page" coordsize="67576,990" o:gfxdata="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">
+              <v:group w14:anchorId="67BE77CA" id="Group 26" o:spid="_x0000_s1026" style="position:absolute;margin-left:30.5pt;margin-top:18.75pt;width:532.1pt;height:7.8pt;z-index:15732224;mso-wrap-distance-left:0;mso-wrap-distance-right:0;mso-position-horizontal-relative:page" coordsize="67576,990" o:gfxdata="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">
                 <v:shape id="Image 27" o:spid="_x0000_s1027" type="#_x0000_t75" style="position:absolute;width:67574;height:989;visibility:visible;mso-wrap-style:square" o:gfxdata="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">
                   <v:imagedata r:id="rId25" o:title=""/>
                 </v:shape>
@@ -24749,15 +24717,7 @@
           <w:color w:val="22303A"/>
           <w:sz w:val="16"/>
         </w:rPr>
-        <w:t>Seam</w:t>
-      </w:r>
-      <w:r>
-        <w:rPr>
-          <w:b/>
-          <w:color w:val="22303A"/>
-          <w:sz w:val="16"/>
-        </w:rPr>
-        <w:t>less,</w:t>
+        <w:t>Seamless,</w:t>
       </w:r>
       <w:r>
         <w:rPr>

</xml_diff>